<commit_message>
UX improvements, footer, sonic branding, UAT fixes, crash guard
</commit_message>
<xml_diff>
--- a/Cursive_Services_Handover.docx
+++ b/Cursive_Services_Handover.docx
@@ -688,8 +688,6 @@
             </w:pPr>
             <w:r>
               <w:t xml:space="preserve">Sends order / lead / quote / workspace emails. Sending domain cursivepublishing.com is </w:t>
-            </w:r>
-            <w:r>
               <w:lastRenderedPageBreak/>
               <w:t>verified.</w:t>
             </w:r>
@@ -1738,6 +1736,123 @@
       </w:tr>
     </w:tbl>
     <w:p>
+      <w:pPr>
+        <w:spacing w:before="280" w:after="80"/>
+      </w:pPr>
+      <w:r>
+        <w:rPr>
+          <w:b/>
+          <w:color w:val="111827"/>
+          <w:sz w:val="30"/>
+        </w:rPr>
+        <w:t>7. Admin user roles (owner / admin / editor)</w:t>
+      </w:r>
+    </w:p>
+    <w:p>
+      <w:r>
+        <w:t xml:space="preserve">Every admin signs in at the same /admin dashboard. Their role controls which sections they can see and use:</w:t>
+      </w:r>
+    </w:p>
+    <w:tbl>
+      <w:tblPr>
+        <w:tblStyle w:val="TableGrid"/>
+        <w:tblW w:w="0" w:type="auto"/>
+        <w:tblLook w:val="04A0" w:firstRow="1" w:lastRow="0" w:firstColumn="1" w:lastColumn="0" w:noHBand="0" w:noVBand="1"/>
+      </w:tblPr>
+      <w:tblGrid>
+        <w:gridCol w:w="3407"/>
+        <w:gridCol w:w="5449"/>
+      </w:tblGrid>
+      <w:tr>
+        <w:tc>
+          <w:tcPr>
+            <w:tcW w:w="3744" w:type="dxa"/>
+            <w:shd w:val="clear" w:color="auto" w:fill="FCEFE0"/>
+          </w:tcPr>
+          <w:p>
+            <w:r>
+              <w:rPr>
+                <w:b/>
+              </w:rPr>
+              <w:t xml:space="preserve">Owner</w:t>
+            </w:r>
+          </w:p>
+        </w:tc>
+        <w:tc>
+          <w:tcPr>
+            <w:tcW w:w="5760" w:type="dxa"/>
+          </w:tcPr>
+          <w:p>
+            <w:r>
+              <w:t xml:space="preserve">Full access to everything, and the only role that can manage the admin team (add or remove admins, change roles). At least one owner must always exist. This is the top-level account.</w:t>
+            </w:r>
+          </w:p>
+        </w:tc>
+      </w:tr>
+      <w:tr>
+        <w:tc>
+          <w:tcPr>
+            <w:tcW w:w="3744" w:type="dxa"/>
+            <w:shd w:val="clear" w:color="auto" w:fill="FCEFE0"/>
+          </w:tcPr>
+          <w:p>
+            <w:r>
+              <w:rPr>
+                <w:b/>
+              </w:rPr>
+              <w:t xml:space="preserve">Admin</w:t>
+            </w:r>
+          </w:p>
+        </w:tc>
+        <w:tc>
+          <w:tcPr>
+            <w:tcW w:w="5760" w:type="dxa"/>
+          </w:tcPr>
+          <w:p>
+            <w:r>
+              <w:t xml:space="preserve">Full day-to-day operations: Orders, Workspace, Manuscripts, Quotes, Authors, Books, Promotions and the Activity log, plus Site Content, Layout and Media. Cannot manage other admins.</w:t>
+            </w:r>
+          </w:p>
+        </w:tc>
+      </w:tr>
+      <w:tr>
+        <w:tc>
+          <w:tcPr>
+            <w:tcW w:w="3744" w:type="dxa"/>
+            <w:shd w:val="clear" w:color="auto" w:fill="FCEFE0"/>
+          </w:tcPr>
+          <w:p>
+            <w:r>
+              <w:rPr>
+                <w:b/>
+              </w:rPr>
+              <w:t xml:space="preserve">Editor</w:t>
+            </w:r>
+          </w:p>
+        </w:tc>
+        <w:tc>
+          <w:tcPr>
+            <w:tcW w:w="5760" w:type="dxa"/>
+          </w:tcPr>
+          <w:p>
+            <w:r>
+              <w:t xml:space="preserve">Content-only: Leads, Site Content, Layout and Media. No access to Orders, Workspace, Manuscripts, Authors and other operations.</w:t>
+            </w:r>
+          </w:p>
+        </w:tc>
+      </w:tr>
+    </w:tbl>
+    <w:p>
+      <w:r>
+        <w:rPr>
+          <w:i/>
+          <w:color w:val="6B7280"/>
+          <w:sz w:val="17"/>
+        </w:rPr>
+        <w:t xml:space="preserve">Note: these limits are enforced in the dashboard interface (which sections appear). The database treats all three roles as an admin, so it does not restrict access per role for most data. This is fine for a trusted internal team; ask the developer if you need strict per-role database enforcement.</w:t>
+      </w:r>
+    </w:p>
+    <w:p>
       <w:r>
         <w:rPr>
           <w:i/>

</xml_diff>